<commit_message>
docs(v2.1): aggiunta sezione Tutela/privacy, Licenza MIT integrale, PezzaliApp ecosystem + file LICENSE
</commit_message>
<xml_diff>
--- a/MANUAL.docx
+++ b/MANUAL.docx
@@ -74,7 +74,7 @@
         <w:t xml:space="preserve">2026</w:t>
       </w:r>
     </w:p>
-    <w:bookmarkStart w:id="95" w:name="djapp-manuale-duso"/>
+    <w:bookmarkStart w:id="111" w:name="djapp-manuale-duso"/>
     <w:p>
       <w:pPr>
         <w:pStyle w:val="Heading1"/>
@@ -98,7 +98,7 @@
         <w:t xml:space="preserve"> </w:t>
       </w:r>
       <w:r>
-        <w:t xml:space="preserve">2.0 (riscritto su bundle verificato)</w:t>
+        <w:t xml:space="preserve">2.1 (fact-checked + tutela/licenza/PezzaliApp)</w:t>
       </w:r>
       <w:r>
         <w:t xml:space="preserve"> </w:t>
@@ -364,6 +364,42 @@
       </w:pPr>
       <w:r>
         <w:t xml:space="preserve">Note tecniche</w:t>
+      </w:r>
+    </w:p>
+    <w:p>
+      <w:pPr>
+        <w:numPr>
+          <w:ilvl w:val="0"/>
+          <w:numId w:val="1001"/>
+        </w:numPr>
+        <w:pStyle w:val="Compact"/>
+      </w:pPr>
+      <w:r>
+        <w:t xml:space="preserve">Tutela e privacy</w:t>
+      </w:r>
+    </w:p>
+    <w:p>
+      <w:pPr>
+        <w:numPr>
+          <w:ilvl w:val="0"/>
+          <w:numId w:val="1001"/>
+        </w:numPr>
+        <w:pStyle w:val="Compact"/>
+      </w:pPr>
+      <w:r>
+        <w:t xml:space="preserve">Licenza</w:t>
+      </w:r>
+    </w:p>
+    <w:p>
+      <w:pPr>
+        <w:numPr>
+          <w:ilvl w:val="0"/>
+          <w:numId w:val="1001"/>
+        </w:numPr>
+        <w:pStyle w:val="Compact"/>
+      </w:pPr>
+      <w:r>
+        <w:t xml:space="preserve">PezzaliApp</w:t>
       </w:r>
     </w:p>
     <w:p>
@@ -7517,7 +7553,7 @@
     </w:p>
     <w:bookmarkEnd w:id="85"/>
     <w:bookmarkEnd w:id="86"/>
-    <w:bookmarkStart w:id="94" w:name="note-tecniche"/>
+    <w:bookmarkStart w:id="91" w:name="note-tecniche"/>
     <w:p>
       <w:pPr>
         <w:pStyle w:val="Heading2"/>
@@ -8087,134 +8123,6 @@
       </w:r>
       <w:r>
         <w:t xml:space="preserve">via class extension (recorder) o prototype chain (beatmatch).</w:t>
-      </w:r>
-    </w:p>
-    <w:bookmarkEnd w:id="90"/>
-    <w:bookmarkStart w:id="91" w:name="privacy"/>
-    <w:p>
-      <w:pPr>
-        <w:pStyle w:val="Heading3"/>
-      </w:pPr>
-      <w:r>
-        <w:t xml:space="preserve">15.5 Privacy</w:t>
-      </w:r>
-    </w:p>
-    <w:p>
-      <w:pPr>
-        <w:numPr>
-          <w:ilvl w:val="0"/>
-          <w:numId w:val="1028"/>
-        </w:numPr>
-        <w:pStyle w:val="Compact"/>
-      </w:pPr>
-      <w:r>
-        <w:t xml:space="preserve">Nessun tracking, nessun account</w:t>
-      </w:r>
-    </w:p>
-    <w:p>
-      <w:pPr>
-        <w:numPr>
-          <w:ilvl w:val="0"/>
-          <w:numId w:val="1028"/>
-        </w:numPr>
-        <w:pStyle w:val="Compact"/>
-      </w:pPr>
-      <w:r>
-        <w:t xml:space="preserve">I brani restano sul dispositivo, non vengono mai caricati su server</w:t>
-      </w:r>
-    </w:p>
-    <w:p>
-      <w:pPr>
-        <w:numPr>
-          <w:ilvl w:val="0"/>
-          <w:numId w:val="1028"/>
-        </w:numPr>
-        <w:pStyle w:val="Compact"/>
-      </w:pPr>
-      <w:r>
-        <w:t xml:space="preserve">Service Worker cacha solo l’interfaccia (shell + asset statici)</w:t>
-      </w:r>
-    </w:p>
-    <w:bookmarkEnd w:id="91"/>
-    <w:bookmarkStart w:id="92" w:name="licenza"/>
-    <w:p>
-      <w:pPr>
-        <w:pStyle w:val="Heading3"/>
-      </w:pPr>
-      <w:r>
-        <w:t xml:space="preserve">15.6 Licenza</w:t>
-      </w:r>
-    </w:p>
-    <w:p>
-      <w:pPr>
-        <w:pStyle w:val="FirstParagraph"/>
-      </w:pPr>
-      <w:r>
-        <w:t xml:space="preserve">Progetto personale di Alessandro Pezzali / PezzaliApp. Codice sul repository GitHub</w:t>
-      </w:r>
-      <w:r>
-        <w:t xml:space="preserve"> </w:t>
-      </w:r>
-      <w:r>
-        <w:rPr>
-          <w:rStyle w:val="VerbatimChar"/>
-        </w:rPr>
-        <w:t xml:space="preserve">pezzaliapp/djapp-new</w:t>
-      </w:r>
-      <w:r>
-        <w:t xml:space="preserve">.</w:t>
-      </w:r>
-    </w:p>
-    <w:bookmarkEnd w:id="92"/>
-    <w:bookmarkStart w:id="93" w:name="supporto-e-feedback"/>
-    <w:p>
-      <w:pPr>
-        <w:pStyle w:val="Heading3"/>
-      </w:pPr>
-      <w:r>
-        <w:t xml:space="preserve">15.7 Supporto e feedback</w:t>
-      </w:r>
-    </w:p>
-    <w:p>
-      <w:pPr>
-        <w:numPr>
-          <w:ilvl w:val="0"/>
-          <w:numId w:val="1029"/>
-        </w:numPr>
-        <w:pStyle w:val="Compact"/>
-      </w:pPr>
-      <w:r>
-        <w:t xml:space="preserve">Issue tracker:</w:t>
-      </w:r>
-      <w:r>
-        <w:t xml:space="preserve"> </w:t>
-      </w:r>
-      <w:r>
-        <w:rPr>
-          <w:rStyle w:val="VerbatimChar"/>
-        </w:rPr>
-        <w:t xml:space="preserve">https://github.com/pezzaliapp/djapp-new/issues</w:t>
-      </w:r>
-    </w:p>
-    <w:p>
-      <w:pPr>
-        <w:numPr>
-          <w:ilvl w:val="0"/>
-          <w:numId w:val="1029"/>
-        </w:numPr>
-        <w:pStyle w:val="Compact"/>
-      </w:pPr>
-      <w:r>
-        <w:t xml:space="preserve">Sito autore:</w:t>
-      </w:r>
-      <w:r>
-        <w:t xml:space="preserve"> </w:t>
-      </w:r>
-      <w:r>
-        <w:rPr>
-          <w:rStyle w:val="VerbatimChar"/>
-        </w:rPr>
-        <w:t xml:space="preserve">https://alessandropezzali.it</w:t>
       </w:r>
     </w:p>
     <w:p>
@@ -8224,59 +8132,1869 @@
         </w:pict>
       </w:r>
     </w:p>
+    <w:bookmarkEnd w:id="90"/>
+    <w:bookmarkEnd w:id="91"/>
+    <w:bookmarkStart w:id="98" w:name="tutela-e-privacy"/>
+    <w:p>
+      <w:pPr>
+        <w:pStyle w:val="Heading2"/>
+      </w:pPr>
+      <w:r>
+        <w:t xml:space="preserve">16. Tutela e privacy</w:t>
+      </w:r>
+    </w:p>
+    <w:bookmarkStart w:id="92" w:name="dati-trattati"/>
+    <w:p>
+      <w:pPr>
+        <w:pStyle w:val="Heading3"/>
+      </w:pPr>
+      <w:r>
+        <w:t xml:space="preserve">16.1 Dati trattati</w:t>
+      </w:r>
+    </w:p>
     <w:p>
       <w:pPr>
         <w:pStyle w:val="FirstParagraph"/>
       </w:pPr>
       <w:r>
-        <w:rPr>
-          <w:bCs/>
-          <w:b/>
-        </w:rPr>
-        <w:t xml:space="preserve">Fine del manuale.</w:t>
+        <w:t xml:space="preserve">djApp è progettato per funzionare</w:t>
+      </w:r>
+      <w:r>
+        <w:t xml:space="preserve"> </w:t>
+      </w:r>
+      <w:r>
+        <w:rPr>
+          <w:bCs/>
+          <w:b/>
+        </w:rPr>
+        <w:t xml:space="preserve">senza raccogliere alcun dato personale dell’utente</w:t>
+      </w:r>
+      <w:r>
+        <w:t xml:space="preserve">.</w:t>
+      </w:r>
+    </w:p>
+    <w:tbl>
+      <w:tblPr>
+        <w:tblStyle w:val="Table"/>
+        <w:tblW w:type="pct" w:w="5000"/>
+        <w:tblLook w:firstRow="1" w:lastRow="0" w:firstColumn="0" w:lastColumn="0" w:noHBand="0" w:noVBand="0" w:val="0020"/>
+        <w:jc w:val="start"/>
+      </w:tblPr>
+      <w:tblGrid>
+        <w:gridCol w:w="3960"/>
+        <w:gridCol w:w="3960"/>
+      </w:tblGrid>
+      <w:tr>
+        <w:trPr>
+          <w:tblHeader w:val="true"/>
+        </w:trPr>
+        <w:tc>
+          <w:tcPr/>
+          <w:p>
+            <w:pPr>
+              <w:pStyle w:val="Compact"/>
+              <w:jc w:val="left"/>
+            </w:pPr>
+            <w:r>
+              <w:t xml:space="preserve">Categoria</w:t>
+            </w:r>
+          </w:p>
+        </w:tc>
+        <w:tc>
+          <w:tcPr/>
+          <w:p>
+            <w:pPr>
+              <w:pStyle w:val="Compact"/>
+              <w:jc w:val="left"/>
+            </w:pPr>
+            <w:r>
+              <w:t xml:space="preserve">Trattamento in djApp</w:t>
+            </w:r>
+          </w:p>
+        </w:tc>
+      </w:tr>
+      <w:tr>
+        <w:tc>
+          <w:tcPr/>
+          <w:p>
+            <w:pPr>
+              <w:pStyle w:val="Compact"/>
+              <w:jc w:val="left"/>
+            </w:pPr>
+            <w:r>
+              <w:t xml:space="preserve">Account utente</w:t>
+            </w:r>
+          </w:p>
+        </w:tc>
+        <w:tc>
+          <w:tcPr/>
+          <w:p>
+            <w:pPr>
+              <w:pStyle w:val="Compact"/>
+              <w:jc w:val="left"/>
+            </w:pPr>
+            <w:r>
+              <w:t xml:space="preserve">Nessuno. Non esistono registrazione né login</w:t>
+            </w:r>
+          </w:p>
+        </w:tc>
+      </w:tr>
+      <w:tr>
+        <w:tc>
+          <w:tcPr/>
+          <w:p>
+            <w:pPr>
+              <w:pStyle w:val="Compact"/>
+              <w:jc w:val="left"/>
+            </w:pPr>
+            <w:r>
+              <w:t xml:space="preserve">Cookie di profilazione</w:t>
+            </w:r>
+          </w:p>
+        </w:tc>
+        <w:tc>
+          <w:tcPr/>
+          <w:p>
+            <w:pPr>
+              <w:pStyle w:val="Compact"/>
+              <w:jc w:val="left"/>
+            </w:pPr>
+            <w:r>
+              <w:t xml:space="preserve">Nessuno</w:t>
+            </w:r>
+          </w:p>
+        </w:tc>
+      </w:tr>
+      <w:tr>
+        <w:tc>
+          <w:tcPr/>
+          <w:p>
+            <w:pPr>
+              <w:pStyle w:val="Compact"/>
+              <w:jc w:val="left"/>
+            </w:pPr>
+            <w:r>
+              <w:t xml:space="preserve">Cookie tecnici</w:t>
+            </w:r>
+          </w:p>
+        </w:tc>
+        <w:tc>
+          <w:tcPr/>
+          <w:p>
+            <w:pPr>
+              <w:pStyle w:val="Compact"/>
+              <w:jc w:val="left"/>
+            </w:pPr>
+            <w:r>
+              <w:t xml:space="preserve">Nessuno</w:t>
+            </w:r>
+          </w:p>
+        </w:tc>
+      </w:tr>
+      <w:tr>
+        <w:tc>
+          <w:tcPr/>
+          <w:p>
+            <w:pPr>
+              <w:pStyle w:val="Compact"/>
+              <w:jc w:val="left"/>
+            </w:pPr>
+            <w:r>
+              <w:t xml:space="preserve">Tracking analytics</w:t>
+            </w:r>
+          </w:p>
+        </w:tc>
+        <w:tc>
+          <w:tcPr/>
+          <w:p>
+            <w:pPr>
+              <w:pStyle w:val="Compact"/>
+              <w:jc w:val="left"/>
+            </w:pPr>
+            <w:r>
+              <w:t xml:space="preserve">Nessuno (no Google Analytics, no Plausible, no Matomo)</w:t>
+            </w:r>
+          </w:p>
+        </w:tc>
+      </w:tr>
+      <w:tr>
+        <w:tc>
+          <w:tcPr/>
+          <w:p>
+            <w:pPr>
+              <w:pStyle w:val="Compact"/>
+              <w:jc w:val="left"/>
+            </w:pPr>
+            <w:r>
+              <w:t xml:space="preserve">Dati di utilizzo inviati a server</w:t>
+            </w:r>
+          </w:p>
+        </w:tc>
+        <w:tc>
+          <w:tcPr/>
+          <w:p>
+            <w:pPr>
+              <w:pStyle w:val="Compact"/>
+              <w:jc w:val="left"/>
+            </w:pPr>
+            <w:r>
+              <w:t xml:space="preserve">Nessuno</w:t>
+            </w:r>
+          </w:p>
+        </w:tc>
+      </w:tr>
+      <w:tr>
+        <w:tc>
+          <w:tcPr/>
+          <w:p>
+            <w:pPr>
+              <w:pStyle w:val="Compact"/>
+              <w:jc w:val="left"/>
+            </w:pPr>
+            <w:r>
+              <w:t xml:space="preserve">Dati biometrici</w:t>
+            </w:r>
+          </w:p>
+        </w:tc>
+        <w:tc>
+          <w:tcPr/>
+          <w:p>
+            <w:pPr>
+              <w:pStyle w:val="Compact"/>
+              <w:jc w:val="left"/>
+            </w:pPr>
+            <w:r>
+              <w:t xml:space="preserve">Nessuno</w:t>
+            </w:r>
+          </w:p>
+        </w:tc>
+      </w:tr>
+      <w:tr>
+        <w:tc>
+          <w:tcPr/>
+          <w:p>
+            <w:pPr>
+              <w:pStyle w:val="Compact"/>
+              <w:jc w:val="left"/>
+            </w:pPr>
+            <w:r>
+              <w:t xml:space="preserve">Dati di pagamento</w:t>
+            </w:r>
+          </w:p>
+        </w:tc>
+        <w:tc>
+          <w:tcPr/>
+          <w:p>
+            <w:pPr>
+              <w:pStyle w:val="Compact"/>
+              <w:jc w:val="left"/>
+            </w:pPr>
+            <w:r>
+              <w:t xml:space="preserve">Nessuno. L’applicazione è gratuita</w:t>
+            </w:r>
+          </w:p>
+        </w:tc>
+      </w:tr>
+    </w:tbl>
+    <w:bookmarkEnd w:id="92"/>
+    <w:bookmarkStart w:id="93" w:name="cosa-viene-memorizzato-localmente"/>
+    <w:p>
+      <w:pPr>
+        <w:pStyle w:val="Heading3"/>
+      </w:pPr>
+      <w:r>
+        <w:t xml:space="preserve">16.2 Cosa viene memorizzato localmente</w:t>
+      </w:r>
+    </w:p>
+    <w:p>
+      <w:pPr>
+        <w:pStyle w:val="FirstParagraph"/>
+      </w:pPr>
+      <w:r>
+        <w:t xml:space="preserve">djApp utilizza esclusivamente la memoria del browser dell’utente, senza alcuna trasmissione a server esterni:</w:t>
+      </w:r>
+    </w:p>
+    <w:p>
+      <w:pPr>
+        <w:numPr>
+          <w:ilvl w:val="0"/>
+          <w:numId w:val="1028"/>
+        </w:numPr>
+        <w:pStyle w:val="Compact"/>
+      </w:pPr>
+      <w:r>
+        <w:rPr>
+          <w:bCs/>
+          <w:b/>
+        </w:rPr>
+        <w:t xml:space="preserve">Cache Service Worker</w:t>
+      </w:r>
+      <w:r>
+        <w:t xml:space="preserve">: solo i file statici dell’interfaccia (HTML, CSS, JS, icone). Serve per l’uso offline. Si svuota manualmente da DevTools → Application → Clear site data</w:t>
+      </w:r>
+    </w:p>
+    <w:p>
+      <w:pPr>
+        <w:numPr>
+          <w:ilvl w:val="0"/>
+          <w:numId w:val="1028"/>
+        </w:numPr>
+        <w:pStyle w:val="Compact"/>
+      </w:pPr>
+      <w:r>
+        <w:rPr>
+          <w:bCs/>
+          <w:b/>
+        </w:rPr>
+        <w:t xml:space="preserve">localStorage</w:t>
+      </w:r>
+      <w:r>
+        <w:t xml:space="preserve">: l’overlay Beatmatch salva la posizione del pannello e lo stato collassato (chiavi</w:t>
+      </w:r>
+      <w:r>
+        <w:t xml:space="preserve"> </w:t>
+      </w:r>
+      <w:r>
+        <w:rPr>
+          <w:rStyle w:val="VerbatimChar"/>
+        </w:rPr>
+        <w:t xml:space="preserve">djapp_bm_pos</w:t>
+      </w:r>
+      <w:r>
+        <w:t xml:space="preserve">,</w:t>
+      </w:r>
+      <w:r>
+        <w:t xml:space="preserve"> </w:t>
+      </w:r>
+      <w:r>
+        <w:rPr>
+          <w:rStyle w:val="VerbatimChar"/>
+        </w:rPr>
+        <w:t xml:space="preserve">djapp_bm_collapsed</w:t>
+      </w:r>
+      <w:r>
+        <w:t xml:space="preserve">). Nessun altro dato viene scritto</w:t>
+      </w:r>
+    </w:p>
+    <w:p>
+      <w:pPr>
+        <w:numPr>
+          <w:ilvl w:val="0"/>
+          <w:numId w:val="1028"/>
+        </w:numPr>
+        <w:pStyle w:val="Compact"/>
+      </w:pPr>
+      <w:r>
+        <w:rPr>
+          <w:bCs/>
+          <w:b/>
+        </w:rPr>
+        <w:t xml:space="preserve">AudioBuffer in RAM</w:t>
+      </w:r>
+      <w:r>
+        <w:t xml:space="preserve">: i brani caricati restano nella memoria del browser per la durata della sessione. Vengono rilasciati alla chiusura della tab</w:t>
+      </w:r>
+    </w:p>
+    <w:bookmarkEnd w:id="93"/>
+    <w:bookmarkStart w:id="94" w:name="compatibilità-normativa"/>
+    <w:p>
+      <w:pPr>
+        <w:pStyle w:val="Heading3"/>
+      </w:pPr>
+      <w:r>
+        <w:t xml:space="preserve">16.3 Compatibilità normativa</w:t>
+      </w:r>
+    </w:p>
+    <w:p>
+      <w:pPr>
+        <w:pStyle w:val="FirstParagraph"/>
+      </w:pPr>
+      <w:r>
+        <w:t xml:space="preserve">Nel momento in cui non vengono raccolti né trattati dati personali, djApp è conforme al</w:t>
+      </w:r>
+      <w:r>
+        <w:t xml:space="preserve"> </w:t>
+      </w:r>
+      <w:r>
+        <w:rPr>
+          <w:bCs/>
+          <w:b/>
+        </w:rPr>
+        <w:t xml:space="preserve">Regolamento Generale sulla Protezione dei Dati (GDPR, Regolamento UE 2016/679)</w:t>
+      </w:r>
+      <w:r>
+        <w:t xml:space="preserve">. L’installazione e l’uso non richiedono informative privacy né acquisizione di consensi, in quanto non vi è alcun titolare del trattamento per dati inesistenti.</w:t>
+      </w:r>
+    </w:p>
+    <w:bookmarkEnd w:id="94"/>
+    <w:bookmarkStart w:id="95" w:name="diritti-dautore-dei-contenuti-audio"/>
+    <w:p>
+      <w:pPr>
+        <w:pStyle w:val="Heading3"/>
+      </w:pPr>
+      <w:r>
+        <w:t xml:space="preserve">16.4 Diritti d’autore dei contenuti audio</w:t>
+      </w:r>
+    </w:p>
+    <w:p>
+      <w:pPr>
+        <w:pStyle w:val="FirstParagraph"/>
+      </w:pPr>
+      <w:r>
+        <w:rPr>
+          <w:bCs/>
+          <w:b/>
+        </w:rPr>
+        <w:t xml:space="preserve">Responsabilità dell’utente</w:t>
+      </w:r>
+      <w:r>
+        <w:t xml:space="preserve">. djApp è uno strumento tecnico: fornisce la capacità di mixare due tracce audio, ma non fornisce alcuna traccia musicale.</w:t>
       </w:r>
     </w:p>
     <w:p>
       <w:pPr>
         <w:pStyle w:val="BodyText"/>
       </w:pPr>
+      <w:r>
+        <w:t xml:space="preserve">L’utente è l’unico responsabile della legittimità dei contenuti che carica nell’applicazione. L’uso di brani protetti da copyright, l’esecuzione in pubblico, la trasmissione o la pubblicazione di remix e registrazioni richiedono titolo all’uso secondo la normativa vigente (diritti d’autore, diritti connessi SIAE/SCF in Italia, licenze sincronizzazione e simili).</w:t>
+      </w:r>
+    </w:p>
+    <w:p>
+      <w:pPr>
+        <w:pStyle w:val="BodyText"/>
+      </w:pPr>
+      <w:r>
+        <w:t xml:space="preserve">Il file WAV generato dall’overlay Recorder è un’opera derivata: la sua diffusione richiede che l’utente disponga dei diritti necessari per tutte le tracce mixate.</w:t>
+      </w:r>
+    </w:p>
+    <w:bookmarkEnd w:id="95"/>
+    <w:bookmarkStart w:id="96" w:name="disclaimer"/>
+    <w:p>
+      <w:pPr>
+        <w:pStyle w:val="Heading3"/>
+      </w:pPr>
+      <w:r>
+        <w:t xml:space="preserve">16.5 Disclaimer</w:t>
+      </w:r>
+    </w:p>
+    <w:p>
+      <w:pPr>
+        <w:pStyle w:val="FirstParagraph"/>
+      </w:pPr>
+      <w:r>
+        <w:t xml:space="preserve">djApp è fornito</w:t>
+      </w:r>
+      <w:r>
+        <w:t xml:space="preserve"> </w:t>
+      </w:r>
+      <w:r>
+        <w:t xml:space="preserve">“</w:t>
+      </w:r>
+      <w:r>
+        <w:t xml:space="preserve">così com’è</w:t>
+      </w:r>
+      <w:r>
+        <w:t xml:space="preserve">”</w:t>
+      </w:r>
+      <w:r>
+        <w:t xml:space="preserve"> </w:t>
+      </w:r>
+      <w:r>
+        <w:t xml:space="preserve">(</w:t>
+      </w:r>
       <w:r>
         <w:rPr>
           <w:iCs/>
           <w:i/>
         </w:rPr>
-        <w:t xml:space="preserve">Documento verificato sul bundle</w:t>
-      </w:r>
+        <w:t xml:space="preserve">as is</w:t>
+      </w:r>
+      <w:r>
+        <w:t xml:space="preserve">), senza garanzie esplicite o implicite. L’autore non risponde per eventuali malfunzionamenti, perdita di dati, interruzioni audio durante eventi dal vivo, problemi di latenza, o qualsiasi altro danno diretto o indiretto derivante dall’uso dell’applicazione. L’utente si assume la responsabilità di verificare l’adeguatezza dello strumento al proprio caso d’uso.</w:t>
+      </w:r>
+    </w:p>
+    <w:p>
+      <w:pPr>
+        <w:pStyle w:val="BodyText"/>
+      </w:pPr>
+      <w:r>
+        <w:t xml:space="preserve">L’analisi BPM automatica è un ausilio basato su un algoritmo di autocorrelazione e può fornire valori errati su alcuni generi musicali: non va considerata una misura esatta.</w:t>
+      </w:r>
+    </w:p>
+    <w:bookmarkEnd w:id="96"/>
+    <w:bookmarkStart w:id="97" w:name="sicurezza"/>
+    <w:p>
+      <w:pPr>
+        <w:pStyle w:val="Heading3"/>
+      </w:pPr>
+      <w:r>
+        <w:t xml:space="preserve">16.6 Sicurezza</w:t>
+      </w:r>
+    </w:p>
+    <w:p>
+      <w:pPr>
+        <w:numPr>
+          <w:ilvl w:val="0"/>
+          <w:numId w:val="1029"/>
+        </w:numPr>
+        <w:pStyle w:val="Compact"/>
+      </w:pPr>
+      <w:r>
+        <w:t xml:space="preserve">Il protocollo HTTPS è obbligatorio per il funzionamento dell’AudioContext e garantisce trasmissione cifrata del bundle applicativo</w:t>
+      </w:r>
+    </w:p>
+    <w:p>
+      <w:pPr>
+        <w:numPr>
+          <w:ilvl w:val="0"/>
+          <w:numId w:val="1029"/>
+        </w:numPr>
+        <w:pStyle w:val="Compact"/>
+      </w:pPr>
+      <w:r>
+        <w:t xml:space="preserve">Il Service Worker viene aggiornato automaticamente quando viene rilasciata una nuova versione</w:t>
+      </w:r>
+    </w:p>
+    <w:p>
+      <w:pPr>
+        <w:numPr>
+          <w:ilvl w:val="0"/>
+          <w:numId w:val="1029"/>
+        </w:numPr>
+        <w:pStyle w:val="Compact"/>
+      </w:pPr>
+      <w:r>
+        <w:t xml:space="preserve">Non vengono caricate librerie di terze parti da CDN remoti in fase di runtime</w:t>
+      </w:r>
+    </w:p>
+    <w:p>
+      <w:r>
+        <w:pict>
+          <v:rect style="width:0;height:1.5pt" o:hralign="center" o:hrstd="t" o:hr="t"/>
+        </w:pict>
+      </w:r>
+    </w:p>
+    <w:bookmarkEnd w:id="97"/>
+    <w:bookmarkEnd w:id="98"/>
+    <w:bookmarkStart w:id="100" w:name="licenza"/>
+    <w:p>
+      <w:pPr>
+        <w:pStyle w:val="Heading2"/>
+      </w:pPr>
+      <w:r>
+        <w:t xml:space="preserve">17. Licenza</w:t>
+      </w:r>
+    </w:p>
+    <w:p>
+      <w:pPr>
+        <w:pStyle w:val="FirstParagraph"/>
+      </w:pPr>
+      <w:r>
+        <w:t xml:space="preserve">djApp è distribuito sotto</w:t>
+      </w:r>
+      <w:r>
+        <w:t xml:space="preserve"> </w:t>
+      </w:r>
+      <w:r>
+        <w:rPr>
+          <w:bCs/>
+          <w:b/>
+        </w:rPr>
+        <w:t xml:space="preserve">MIT License</w:t>
+      </w:r>
+      <w:r>
+        <w:t xml:space="preserve">.</w:t>
+      </w:r>
+    </w:p>
+    <w:p>
+      <w:pPr>
+        <w:pStyle w:val="SourceCode"/>
+      </w:pPr>
+      <w:r>
+        <w:rPr>
+          <w:rStyle w:val="VerbatimChar"/>
+        </w:rPr>
+        <w:t xml:space="preserve">MIT License</w:t>
+      </w:r>
+      <w:r>
+        <w:br/>
+      </w:r>
+      <w:r>
+        <w:br/>
+      </w:r>
+      <w:r>
+        <w:rPr>
+          <w:rStyle w:val="VerbatimChar"/>
+        </w:rPr>
+        <w:t xml:space="preserve">Copyright (c) 2024-2026 Alessandro Pezzali — PezzaliApp</w:t>
+      </w:r>
+      <w:r>
+        <w:br/>
+      </w:r>
+      <w:r>
+        <w:br/>
+      </w:r>
+      <w:r>
+        <w:rPr>
+          <w:rStyle w:val="VerbatimChar"/>
+        </w:rPr>
+        <w:t xml:space="preserve">Permission is hereby granted, free of charge, to any person obtaining a copy</w:t>
+      </w:r>
+      <w:r>
+        <w:br/>
+      </w:r>
+      <w:r>
+        <w:rPr>
+          <w:rStyle w:val="VerbatimChar"/>
+        </w:rPr>
+        <w:t xml:space="preserve">of this software and associated documentation files (the "Software"), to deal</w:t>
+      </w:r>
+      <w:r>
+        <w:br/>
+      </w:r>
+      <w:r>
+        <w:rPr>
+          <w:rStyle w:val="VerbatimChar"/>
+        </w:rPr>
+        <w:t xml:space="preserve">in the Software without restriction, including without limitation the rights</w:t>
+      </w:r>
+      <w:r>
+        <w:br/>
+      </w:r>
+      <w:r>
+        <w:rPr>
+          <w:rStyle w:val="VerbatimChar"/>
+        </w:rPr>
+        <w:t xml:space="preserve">to use, copy, modify, merge, publish, distribute, sublicense, and/or sell</w:t>
+      </w:r>
+      <w:r>
+        <w:br/>
+      </w:r>
+      <w:r>
+        <w:rPr>
+          <w:rStyle w:val="VerbatimChar"/>
+        </w:rPr>
+        <w:t xml:space="preserve">copies of the Software, and to permit persons to whom the Software is</w:t>
+      </w:r>
+      <w:r>
+        <w:br/>
+      </w:r>
+      <w:r>
+        <w:rPr>
+          <w:rStyle w:val="VerbatimChar"/>
+        </w:rPr>
+        <w:t xml:space="preserve">furnished to do so, subject to the following conditions:</w:t>
+      </w:r>
+      <w:r>
+        <w:br/>
+      </w:r>
+      <w:r>
+        <w:br/>
+      </w:r>
+      <w:r>
+        <w:rPr>
+          <w:rStyle w:val="VerbatimChar"/>
+        </w:rPr>
+        <w:t xml:space="preserve">The above copyright notice and this permission notice shall be included in all</w:t>
+      </w:r>
+      <w:r>
+        <w:br/>
+      </w:r>
+      <w:r>
+        <w:rPr>
+          <w:rStyle w:val="VerbatimChar"/>
+        </w:rPr>
+        <w:t xml:space="preserve">copies or substantial portions of the Software.</w:t>
+      </w:r>
+      <w:r>
+        <w:br/>
+      </w:r>
+      <w:r>
+        <w:br/>
+      </w:r>
+      <w:r>
+        <w:rPr>
+          <w:rStyle w:val="VerbatimChar"/>
+        </w:rPr>
+        <w:t xml:space="preserve">THE SOFTWARE IS PROVIDED "AS IS", WITHOUT WARRANTY OF ANY KIND, EXPRESS OR</w:t>
+      </w:r>
+      <w:r>
+        <w:br/>
+      </w:r>
+      <w:r>
+        <w:rPr>
+          <w:rStyle w:val="VerbatimChar"/>
+        </w:rPr>
+        <w:t xml:space="preserve">IMPLIED, INCLUDING BUT NOT LIMITED TO THE WARRANTIES OF MERCHANTABILITY,</w:t>
+      </w:r>
+      <w:r>
+        <w:br/>
+      </w:r>
+      <w:r>
+        <w:rPr>
+          <w:rStyle w:val="VerbatimChar"/>
+        </w:rPr>
+        <w:t xml:space="preserve">FITNESS FOR A PARTICULAR PURPOSE AND NONINFRINGEMENT. IN NO EVENT SHALL THE</w:t>
+      </w:r>
+      <w:r>
+        <w:br/>
+      </w:r>
+      <w:r>
+        <w:rPr>
+          <w:rStyle w:val="VerbatimChar"/>
+        </w:rPr>
+        <w:t xml:space="preserve">AUTHORS OR COPYRIGHT HOLDERS BE LIABLE FOR ANY CLAIM, DAMAGES OR OTHER</w:t>
+      </w:r>
+      <w:r>
+        <w:br/>
+      </w:r>
+      <w:r>
+        <w:rPr>
+          <w:rStyle w:val="VerbatimChar"/>
+        </w:rPr>
+        <w:t xml:space="preserve">LIABILITY, WHETHER IN AN ACTION OF CONTRACT, TORT OR OTHERWISE, ARISING FROM,</w:t>
+      </w:r>
+      <w:r>
+        <w:br/>
+      </w:r>
+      <w:r>
+        <w:rPr>
+          <w:rStyle w:val="VerbatimChar"/>
+        </w:rPr>
+        <w:t xml:space="preserve">OUT OF OR IN CONNECTION WITH THE SOFTWARE OR THE USE OR OTHER DEALINGS IN THE</w:t>
+      </w:r>
+      <w:r>
+        <w:br/>
+      </w:r>
+      <w:r>
+        <w:rPr>
+          <w:rStyle w:val="VerbatimChar"/>
+        </w:rPr>
+        <w:t xml:space="preserve">SOFTWARE.</w:t>
+      </w:r>
+    </w:p>
+    <w:p>
+      <w:pPr>
+        <w:pStyle w:val="FirstParagraph"/>
+      </w:pPr>
+      <w:r>
+        <w:rPr>
+          <w:bCs/>
+          <w:b/>
+        </w:rPr>
+        <w:t xml:space="preserve">In sintesi pratica:</w:t>
+      </w:r>
+    </w:p>
+    <w:p>
+      <w:pPr>
+        <w:numPr>
+          <w:ilvl w:val="0"/>
+          <w:numId w:val="1030"/>
+        </w:numPr>
+        <w:pStyle w:val="Compact"/>
+      </w:pPr>
+      <w:r>
+        <w:t xml:space="preserve">✅ Uso libero, personale e commerciale</w:t>
+      </w:r>
+    </w:p>
+    <w:p>
+      <w:pPr>
+        <w:numPr>
+          <w:ilvl w:val="0"/>
+          <w:numId w:val="1030"/>
+        </w:numPr>
+        <w:pStyle w:val="Compact"/>
+      </w:pPr>
+      <w:r>
+        <w:t xml:space="preserve">✅ Modifica e ridistribuzione consentite</w:t>
+      </w:r>
+    </w:p>
+    <w:p>
+      <w:pPr>
+        <w:numPr>
+          <w:ilvl w:val="0"/>
+          <w:numId w:val="1030"/>
+        </w:numPr>
+        <w:pStyle w:val="Compact"/>
+      </w:pPr>
+      <w:r>
+        <w:t xml:space="preserve">✅ Integrazione in progetti proprietari consentita</w:t>
+      </w:r>
+    </w:p>
+    <w:p>
+      <w:pPr>
+        <w:numPr>
+          <w:ilvl w:val="0"/>
+          <w:numId w:val="1030"/>
+        </w:numPr>
+        <w:pStyle w:val="Compact"/>
+      </w:pPr>
+      <w:r>
+        <w:t xml:space="preserve">⚠️ Obbligo di mantenere il copyright notice e il testo della licenza nelle copie</w:t>
+      </w:r>
+    </w:p>
+    <w:p>
+      <w:pPr>
+        <w:numPr>
+          <w:ilvl w:val="0"/>
+          <w:numId w:val="1030"/>
+        </w:numPr>
+        <w:pStyle w:val="Compact"/>
+      </w:pPr>
+      <w:r>
+        <w:t xml:space="preserve">⚠️ Nessuna garanzia — il software è fornito</w:t>
+      </w:r>
+      <w:r>
+        <w:t xml:space="preserve"> </w:t>
+      </w:r>
+      <w:r>
+        <w:t xml:space="preserve">“</w:t>
+      </w:r>
+      <w:r>
+        <w:t xml:space="preserve">così com’è</w:t>
+      </w:r>
+      <w:r>
+        <w:t xml:space="preserve">”</w:t>
+      </w:r>
+    </w:p>
+    <w:p>
+      <w:pPr>
+        <w:pStyle w:val="FirstParagraph"/>
+      </w:pPr>
+      <w:r>
+        <w:t xml:space="preserve">Il testo integrale della licenza si trova nel file</w:t>
+      </w:r>
+      <w:r>
+        <w:t xml:space="preserve"> </w:t>
+      </w:r>
+      <w:r>
+        <w:rPr>
+          <w:rStyle w:val="VerbatimChar"/>
+        </w:rPr>
+        <w:t xml:space="preserve">LICENSE</w:t>
+      </w:r>
+      <w:r>
+        <w:t xml:space="preserve"> </w:t>
+      </w:r>
+      <w:r>
+        <w:t xml:space="preserve">del repository GitHub.</w:t>
+      </w:r>
+    </w:p>
+    <w:bookmarkStart w:id="99" w:name="librerie-di-terze-parti"/>
+    <w:p>
+      <w:pPr>
+        <w:pStyle w:val="Heading3"/>
+      </w:pPr>
+      <w:r>
+        <w:t xml:space="preserve">17.1 Librerie di terze parti</w:t>
+      </w:r>
+    </w:p>
+    <w:p>
+      <w:pPr>
+        <w:pStyle w:val="FirstParagraph"/>
+      </w:pPr>
+      <w:r>
+        <w:t xml:space="preserve">djApp dipende dai seguenti componenti open-source, le cui licenze sono rispettate e compatibili con MIT:</w:t>
+      </w:r>
+    </w:p>
+    <w:tbl>
+      <w:tblPr>
+        <w:tblStyle w:val="Table"/>
+        <w:tblW w:type="auto" w:w="0"/>
+        <w:tblLook w:firstRow="1" w:lastRow="0" w:firstColumn="0" w:lastColumn="0" w:noHBand="0" w:noVBand="0" w:val="0020"/>
+        <w:jc w:val="start"/>
+      </w:tblPr>
+      <w:tblGrid>
+        <w:gridCol w:w="2640"/>
+        <w:gridCol w:w="2640"/>
+        <w:gridCol w:w="2640"/>
+      </w:tblGrid>
+      <w:tr>
+        <w:trPr>
+          <w:tblHeader w:val="true"/>
+        </w:trPr>
+        <w:tc>
+          <w:tcPr/>
+          <w:p>
+            <w:pPr>
+              <w:pStyle w:val="Compact"/>
+              <w:jc w:val="left"/>
+            </w:pPr>
+            <w:r>
+              <w:t xml:space="preserve">Libreria</w:t>
+            </w:r>
+          </w:p>
+        </w:tc>
+        <w:tc>
+          <w:tcPr/>
+          <w:p>
+            <w:pPr>
+              <w:pStyle w:val="Compact"/>
+              <w:jc w:val="left"/>
+            </w:pPr>
+            <w:r>
+              <w:t xml:space="preserve">Licenza</w:t>
+            </w:r>
+          </w:p>
+        </w:tc>
+        <w:tc>
+          <w:tcPr/>
+          <w:p>
+            <w:pPr>
+              <w:pStyle w:val="Compact"/>
+              <w:jc w:val="left"/>
+            </w:pPr>
+            <w:r>
+              <w:t xml:space="preserve">Uso</w:t>
+            </w:r>
+          </w:p>
+        </w:tc>
+      </w:tr>
+      <w:tr>
+        <w:tc>
+          <w:tcPr/>
+          <w:p>
+            <w:pPr>
+              <w:pStyle w:val="Compact"/>
+              <w:jc w:val="left"/>
+            </w:pPr>
+            <w:r>
+              <w:t xml:space="preserve">React 18</w:t>
+            </w:r>
+          </w:p>
+        </w:tc>
+        <w:tc>
+          <w:tcPr/>
+          <w:p>
+            <w:pPr>
+              <w:pStyle w:val="Compact"/>
+              <w:jc w:val="left"/>
+            </w:pPr>
+            <w:r>
+              <w:t xml:space="preserve">MIT</w:t>
+            </w:r>
+          </w:p>
+        </w:tc>
+        <w:tc>
+          <w:tcPr/>
+          <w:p>
+            <w:pPr>
+              <w:pStyle w:val="Compact"/>
+              <w:jc w:val="left"/>
+            </w:pPr>
+            <w:r>
+              <w:t xml:space="preserve">UI framework</w:t>
+            </w:r>
+          </w:p>
+        </w:tc>
+      </w:tr>
+      <w:tr>
+        <w:tc>
+          <w:tcPr/>
+          <w:p>
+            <w:pPr>
+              <w:pStyle w:val="Compact"/>
+              <w:jc w:val="left"/>
+            </w:pPr>
+            <w:r>
+              <w:t xml:space="preserve">Vite 5</w:t>
+            </w:r>
+          </w:p>
+        </w:tc>
+        <w:tc>
+          <w:tcPr/>
+          <w:p>
+            <w:pPr>
+              <w:pStyle w:val="Compact"/>
+              <w:jc w:val="left"/>
+            </w:pPr>
+            <w:r>
+              <w:t xml:space="preserve">MIT</w:t>
+            </w:r>
+          </w:p>
+        </w:tc>
+        <w:tc>
+          <w:tcPr/>
+          <w:p>
+            <w:pPr>
+              <w:pStyle w:val="Compact"/>
+              <w:jc w:val="left"/>
+            </w:pPr>
+            <w:r>
+              <w:t xml:space="preserve">Build tool</w:t>
+            </w:r>
+          </w:p>
+        </w:tc>
+      </w:tr>
+      <w:tr>
+        <w:tc>
+          <w:tcPr/>
+          <w:p>
+            <w:pPr>
+              <w:pStyle w:val="Compact"/>
+              <w:jc w:val="left"/>
+            </w:pPr>
+            <w:r>
+              <w:t xml:space="preserve">Zustand 4.5</w:t>
+            </w:r>
+          </w:p>
+        </w:tc>
+        <w:tc>
+          <w:tcPr/>
+          <w:p>
+            <w:pPr>
+              <w:pStyle w:val="Compact"/>
+              <w:jc w:val="left"/>
+            </w:pPr>
+            <w:r>
+              <w:t xml:space="preserve">MIT</w:t>
+            </w:r>
+          </w:p>
+        </w:tc>
+        <w:tc>
+          <w:tcPr/>
+          <w:p>
+            <w:pPr>
+              <w:pStyle w:val="Compact"/>
+              <w:jc w:val="left"/>
+            </w:pPr>
+            <w:r>
+              <w:t xml:space="preserve">State management</w:t>
+            </w:r>
+          </w:p>
+        </w:tc>
+      </w:tr>
+      <w:tr>
+        <w:tc>
+          <w:tcPr/>
+          <w:p>
+            <w:pPr>
+              <w:pStyle w:val="Compact"/>
+              <w:jc w:val="left"/>
+            </w:pPr>
+            <w:r>
+              <w:t xml:space="preserve">Web Audio API</w:t>
+            </w:r>
+          </w:p>
+        </w:tc>
+        <w:tc>
+          <w:tcPr/>
+          <w:p>
+            <w:pPr>
+              <w:pStyle w:val="Compact"/>
+              <w:jc w:val="left"/>
+            </w:pPr>
+            <w:r>
+              <w:t xml:space="preserve">Standard W3C</w:t>
+            </w:r>
+          </w:p>
+        </w:tc>
+        <w:tc>
+          <w:tcPr/>
+          <w:p>
+            <w:pPr>
+              <w:pStyle w:val="Compact"/>
+              <w:jc w:val="left"/>
+            </w:pPr>
+            <w:r>
+              <w:t xml:space="preserve">Audio engine (nativa browser)</w:t>
+            </w:r>
+          </w:p>
+        </w:tc>
+      </w:tr>
+    </w:tbl>
+    <w:p>
+      <w:pPr>
+        <w:pStyle w:val="BodyText"/>
+      </w:pPr>
+      <w:r>
+        <w:t xml:space="preserve">Nessuna delle librerie incluse richiede obblighi di copyleft (GPL, AGPL).</w:t>
+      </w:r>
+    </w:p>
+    <w:p>
+      <w:r>
+        <w:pict>
+          <v:rect style="width:0;height:1.5pt" o:hralign="center" o:hrstd="t" o:hr="t"/>
+        </w:pict>
+      </w:r>
+    </w:p>
+    <w:bookmarkEnd w:id="99"/>
+    <w:bookmarkEnd w:id="100"/>
+    <w:bookmarkStart w:id="110" w:name="pezzaliapp"/>
+    <w:p>
+      <w:pPr>
+        <w:pStyle w:val="Heading2"/>
+      </w:pPr>
+      <w:r>
+        <w:t xml:space="preserve">18. PezzaliApp</w:t>
+      </w:r>
+    </w:p>
+    <w:p>
+      <w:pPr>
+        <w:pStyle w:val="FirstParagraph"/>
+      </w:pPr>
+      <w:r>
+        <w:rPr>
+          <w:bCs/>
+          <w:b/>
+        </w:rPr>
+        <w:t xml:space="preserve">PezzaliApp</w:t>
+      </w:r>
+      <w:r>
+        <w:t xml:space="preserve"> </w:t>
+      </w:r>
+      <w:r>
+        <w:t xml:space="preserve">è il brand personale di Alessandro Pezzali, sotto il quale vengono sviluppati e distribuiti progetti open-source trasversali a più ambiti: software professionale per settori verticali, strumenti audio, fotografia, aerospaziale amatoriale, produttività.</w:t>
+      </w:r>
+    </w:p>
+    <w:p>
+      <w:pPr>
+        <w:pStyle w:val="BodyText"/>
+      </w:pPr>
+      <w:r>
+        <w:t xml:space="preserve">djApp fa parte dell’ecosistema PezzaliApp nella categoria</w:t>
+      </w:r>
+      <w:r>
+        <w:t xml:space="preserve"> </w:t>
+      </w:r>
+      <w:r>
+        <w:rPr>
+          <w:bCs/>
+          <w:b/>
+        </w:rPr>
+        <w:t xml:space="preserve">audio/musica</w:t>
+      </w:r>
+      <w:r>
+        <w:t xml:space="preserve">.</w:t>
+      </w:r>
+    </w:p>
+    <w:bookmarkStart w:id="104" w:name="identità"/>
+    <w:p>
+      <w:pPr>
+        <w:pStyle w:val="Heading3"/>
+      </w:pPr>
+      <w:r>
+        <w:t xml:space="preserve">18.1 Identità</w:t>
+      </w:r>
+    </w:p>
+    <w:p>
+      <w:pPr>
+        <w:numPr>
+          <w:ilvl w:val="0"/>
+          <w:numId w:val="1031"/>
+        </w:numPr>
+        <w:pStyle w:val="Compact"/>
+      </w:pPr>
+      <w:r>
+        <w:rPr>
+          <w:bCs/>
+          <w:b/>
+        </w:rPr>
+        <w:t xml:space="preserve">Sito ufficiale</w:t>
+      </w:r>
+      <w:r>
+        <w:t xml:space="preserve">:</w:t>
+      </w:r>
+      <w:r>
+        <w:t xml:space="preserve"> </w:t>
+      </w:r>
+      <w:hyperlink r:id="rId101">
+        <w:r>
+          <w:rPr>
+            <w:rStyle w:val="Hyperlink"/>
+          </w:rPr>
+          <w:t xml:space="preserve">alessandropezzali.it</w:t>
+        </w:r>
+      </w:hyperlink>
+    </w:p>
+    <w:p>
+      <w:pPr>
+        <w:numPr>
+          <w:ilvl w:val="0"/>
+          <w:numId w:val="1031"/>
+        </w:numPr>
+        <w:pStyle w:val="Compact"/>
+      </w:pPr>
+      <w:r>
+        <w:rPr>
+          <w:bCs/>
+          <w:b/>
+        </w:rPr>
+        <w:t xml:space="preserve">Dominio brand</w:t>
+      </w:r>
+      <w:r>
+        <w:t xml:space="preserve">:</w:t>
+      </w:r>
+      <w:r>
+        <w:t xml:space="preserve"> </w:t>
+      </w:r>
+      <w:hyperlink r:id="rId102">
+        <w:r>
+          <w:rPr>
+            <w:rStyle w:val="Hyperlink"/>
+          </w:rPr>
+          <w:t xml:space="preserve">pezzaliapp.com</w:t>
+        </w:r>
+      </w:hyperlink>
+    </w:p>
+    <w:p>
+      <w:pPr>
+        <w:numPr>
+          <w:ilvl w:val="0"/>
+          <w:numId w:val="1031"/>
+        </w:numPr>
+        <w:pStyle w:val="Compact"/>
+      </w:pPr>
+      <w:r>
+        <w:rPr>
+          <w:bCs/>
+          <w:b/>
+        </w:rPr>
+        <w:t xml:space="preserve">GitHub</w:t>
+      </w:r>
+      <w:r>
+        <w:t xml:space="preserve">:</w:t>
+      </w:r>
+      <w:r>
+        <w:t xml:space="preserve"> </w:t>
+      </w:r>
+      <w:hyperlink r:id="rId103">
+        <w:r>
+          <w:rPr>
+            <w:rStyle w:val="Hyperlink"/>
+          </w:rPr>
+          <w:t xml:space="preserve">github.com/pezzaliapp</w:t>
+        </w:r>
+      </w:hyperlink>
+    </w:p>
+    <w:p>
+      <w:pPr>
+        <w:pStyle w:val="FirstParagraph"/>
+      </w:pPr>
+      <w:r>
+        <w:t xml:space="preserve">PezzaliApp è una iniziativa personale autonoma,</w:t>
+      </w:r>
+      <w:r>
+        <w:t xml:space="preserve"> </w:t>
+      </w:r>
+      <w:r>
+        <w:rPr>
+          <w:bCs/>
+          <w:b/>
+        </w:rPr>
+        <w:t xml:space="preserve">non affiliata ad alcuna società o datore di lavoro</w:t>
+      </w:r>
+      <w:r>
+        <w:t xml:space="preserve"> </w:t>
+      </w:r>
+      <w:r>
+        <w:t xml:space="preserve">dell’autore. Tutti i progetti pubblicati sotto il brand sono realizzati nel tempo privato e distribuiti gratuitamente a beneficio della comunità open-source.</w:t>
+      </w:r>
+    </w:p>
+    <w:bookmarkEnd w:id="104"/>
+    <w:bookmarkStart w:id="105" w:name="ecosistema-dei-progetti"/>
+    <w:p>
+      <w:pPr>
+        <w:pStyle w:val="Heading3"/>
+      </w:pPr>
+      <w:r>
+        <w:t xml:space="preserve">18.2 Ecosistema dei progetti</w:t>
+      </w:r>
+    </w:p>
+    <w:p>
+      <w:pPr>
+        <w:pStyle w:val="FirstParagraph"/>
+      </w:pPr>
+      <w:r>
+        <w:t xml:space="preserve">A titolo indicativo, altre applicazioni dell’ecosistema PezzaliApp disponibili pubblicamente:</w:t>
+      </w:r>
+    </w:p>
+    <w:p>
+      <w:pPr>
+        <w:pStyle w:val="BodyText"/>
+      </w:pPr>
+      <w:r>
+        <w:rPr>
+          <w:bCs/>
+          <w:b/>
+        </w:rPr>
+        <w:t xml:space="preserve">Area audio e musica</w:t>
+      </w:r>
+    </w:p>
+    <w:p>
+      <w:pPr>
+        <w:numPr>
+          <w:ilvl w:val="0"/>
+          <w:numId w:val="1032"/>
+        </w:numPr>
+        <w:pStyle w:val="Compact"/>
+      </w:pPr>
+      <w:r>
+        <w:rPr>
+          <w:bCs/>
+          <w:b/>
+        </w:rPr>
+        <w:t xml:space="preserve">Minimoog Model D emulator</w:t>
+      </w:r>
+      <w:r>
+        <w:t xml:space="preserve"> </w:t>
+      </w:r>
+      <w:r>
+        <w:t xml:space="preserve">— emulatore web del sintetizzatore analogico Moog</w:t>
+      </w:r>
+    </w:p>
+    <w:p>
+      <w:pPr>
+        <w:numPr>
+          <w:ilvl w:val="0"/>
+          <w:numId w:val="1032"/>
+        </w:numPr>
+        <w:pStyle w:val="Compact"/>
+      </w:pPr>
+      <w:r>
+        <w:rPr>
+          <w:bCs/>
+          <w:b/>
+        </w:rPr>
+        <w:t xml:space="preserve">Poly8 Synth</w:t>
+      </w:r>
+      <w:r>
+        <w:t xml:space="preserve"> </w:t>
+      </w:r>
+      <w:r>
+        <w:t xml:space="preserve">(Moog Muse emulator) — sintetizzatore polifonico PWA</w:t>
+      </w:r>
+    </w:p>
+    <w:p>
+      <w:pPr>
+        <w:numPr>
+          <w:ilvl w:val="0"/>
+          <w:numId w:val="1032"/>
+        </w:numPr>
+        <w:pStyle w:val="Compact"/>
+      </w:pPr>
+      <w:r>
+        <w:rPr>
+          <w:bCs/>
+          <w:b/>
+        </w:rPr>
+        <w:t xml:space="preserve">Helion Guitars — Double Cut S1</w:t>
+      </w:r>
+      <w:r>
+        <w:t xml:space="preserve"> </w:t>
+      </w:r>
+      <w:r>
+        <w:t xml:space="preserve">— emulatore di chitarra elettrica basato su sintesi Karplus-Strong</w:t>
+      </w:r>
+    </w:p>
+    <w:p>
+      <w:pPr>
+        <w:pStyle w:val="FirstParagraph"/>
+      </w:pPr>
+      <w:r>
+        <w:rPr>
+          <w:bCs/>
+          <w:b/>
+        </w:rPr>
+        <w:t xml:space="preserve">Area spazio / aerospace amatoriale</w:t>
+      </w:r>
+    </w:p>
+    <w:p>
+      <w:pPr>
+        <w:numPr>
+          <w:ilvl w:val="0"/>
+          <w:numId w:val="1033"/>
+        </w:numPr>
+        <w:pStyle w:val="Compact"/>
+      </w:pPr>
+      <w:r>
+        <w:rPr>
+          <w:bCs/>
+          <w:b/>
+        </w:rPr>
+        <w:t xml:space="preserve">CubeSat Flight Management System</w:t>
+      </w:r>
+      <w:r>
+        <w:t xml:space="preserve"> </w:t>
+      </w:r>
+      <w:r>
+        <w:t xml:space="preserve">— sistema di gestione volo per satelliti CubeSat (</w:t>
+      </w:r>
+      <w:r>
+        <w:rPr>
+          <w:rStyle w:val="VerbatimChar"/>
+        </w:rPr>
+        <w:t xml:space="preserve">github.com/PezzaliStack/CubeSatV1</w:t>
+      </w:r>
+      <w:r>
+        <w:t xml:space="preserve">)</w:t>
+      </w:r>
+    </w:p>
+    <w:p>
+      <w:pPr>
+        <w:numPr>
+          <w:ilvl w:val="0"/>
+          <w:numId w:val="1033"/>
+        </w:numPr>
+        <w:pStyle w:val="Compact"/>
+      </w:pPr>
+      <w:r>
+        <w:rPr>
+          <w:bCs/>
+          <w:b/>
+        </w:rPr>
+        <w:t xml:space="preserve">PhotonExplorer</w:t>
+      </w:r>
+      <w:r>
+        <w:t xml:space="preserve"> </w:t>
+      </w:r>
+      <w:r>
+        <w:t xml:space="preserve">— pianificatore di missioni di volo drone</w:t>
+      </w:r>
+    </w:p>
+    <w:p>
+      <w:pPr>
+        <w:pStyle w:val="FirstParagraph"/>
+      </w:pPr>
+      <w:r>
+        <w:rPr>
+          <w:bCs/>
+          <w:b/>
+        </w:rPr>
+        <w:t xml:space="preserve">Area produttività e lavoro</w:t>
+      </w:r>
+    </w:p>
+    <w:p>
+      <w:pPr>
+        <w:numPr>
+          <w:ilvl w:val="0"/>
+          <w:numId w:val="1034"/>
+        </w:numPr>
+        <w:pStyle w:val="Compact"/>
+      </w:pPr>
+      <w:r>
+        <w:rPr>
+          <w:bCs/>
+          <w:b/>
+        </w:rPr>
+        <w:t xml:space="preserve">CSVXpressPlus / CSVXpressSmart</w:t>
+      </w:r>
+      <w:r>
+        <w:t xml:space="preserve"> </w:t>
+      </w:r>
+      <w:r>
+        <w:t xml:space="preserve">— strumenti di elaborazione CSV e listini</w:t>
+      </w:r>
+    </w:p>
+    <w:p>
+      <w:pPr>
+        <w:numPr>
+          <w:ilvl w:val="0"/>
+          <w:numId w:val="1034"/>
+        </w:numPr>
+        <w:pStyle w:val="Compact"/>
+      </w:pPr>
+      <w:r>
+        <w:rPr>
+          <w:bCs/>
+          <w:b/>
+        </w:rPr>
+        <w:t xml:space="preserve">TriageFirst</w:t>
+      </w:r>
+      <w:r>
+        <w:t xml:space="preserve"> </w:t>
+      </w:r>
+      <w:r>
+        <w:t xml:space="preserve">— PWA di triage medico multilingue (22 lingue)</w:t>
+      </w:r>
+    </w:p>
+    <w:p>
+      <w:pPr>
+        <w:pStyle w:val="FirstParagraph"/>
+      </w:pPr>
+      <w:r>
+        <w:rPr>
+          <w:bCs/>
+          <w:b/>
+        </w:rPr>
+        <w:t xml:space="preserve">Area assistenza tecnica settoriale</w:t>
+      </w:r>
+    </w:p>
+    <w:p>
+      <w:pPr>
+        <w:numPr>
+          <w:ilvl w:val="0"/>
+          <w:numId w:val="1035"/>
+        </w:numPr>
+        <w:pStyle w:val="Compact"/>
+      </w:pPr>
+      <w:r>
+        <w:rPr>
+          <w:bCs/>
+          <w:b/>
+        </w:rPr>
+        <w:t xml:space="preserve">TechAssist AI</w:t>
+      </w:r>
+      <w:r>
+        <w:t xml:space="preserve"> </w:t>
+      </w:r>
+      <w:r>
+        <w:t xml:space="preserve">— assistente tecnico per attrezzatura da officina</w:t>
+      </w:r>
+    </w:p>
+    <w:p>
+      <w:pPr>
+        <w:numPr>
+          <w:ilvl w:val="0"/>
+          <w:numId w:val="1035"/>
+        </w:numPr>
+        <w:pStyle w:val="Compact"/>
+      </w:pPr>
+      <w:r>
+        <w:rPr>
+          <w:bCs/>
+          <w:b/>
+        </w:rPr>
+        <w:t xml:space="preserve">GommistaPro-Assistant</w:t>
+      </w:r>
+      <w:r>
+        <w:t xml:space="preserve"> </w:t>
+      </w:r>
+      <w:r>
+        <w:t xml:space="preserve">— assistente AI per rivenditori di attrezzature per gommisti</w:t>
+      </w:r>
+    </w:p>
+    <w:p>
+      <w:pPr>
+        <w:numPr>
+          <w:ilvl w:val="0"/>
+          <w:numId w:val="1035"/>
+        </w:numPr>
+        <w:pStyle w:val="Compact"/>
+      </w:pPr>
+      <w:r>
+        <w:rPr>
+          <w:bCs/>
+          <w:b/>
+        </w:rPr>
+        <w:t xml:space="preserve">TireCheck Pro</w:t>
+      </w:r>
+      <w:r>
+        <w:t xml:space="preserve"> </w:t>
+      </w:r>
+      <w:r>
+        <w:t xml:space="preserve">— diagnostica pneumatici con AI vision</w:t>
+      </w:r>
+    </w:p>
+    <w:p>
+      <w:pPr>
+        <w:pStyle w:val="FirstParagraph"/>
+      </w:pPr>
+      <w:r>
+        <w:t xml:space="preserve">Tutti i progetti seguono principi comuni:</w:t>
+      </w:r>
+      <w:r>
+        <w:t xml:space="preserve"> </w:t>
+      </w:r>
+      <w:r>
+        <w:rPr>
+          <w:bCs/>
+          <w:b/>
+        </w:rPr>
+        <w:t xml:space="preserve">PWA mobile-first</w:t>
+      </w:r>
+      <w:r>
+        <w:t xml:space="preserve">, architettura client-side, nessuna dipendenza da servizi cloud proprietari, codice leggibile e pubblicato su GitHub.</w:t>
+      </w:r>
+    </w:p>
+    <w:bookmarkEnd w:id="105"/>
+    <w:bookmarkStart w:id="106" w:name="filosofia-di-design"/>
+    <w:p>
+      <w:pPr>
+        <w:pStyle w:val="Heading3"/>
+      </w:pPr>
+      <w:r>
+        <w:t xml:space="preserve">18.3 Filosofia di design</w:t>
+      </w:r>
+    </w:p>
+    <w:p>
+      <w:pPr>
+        <w:pStyle w:val="FirstParagraph"/>
+      </w:pPr>
+      <w:r>
+        <w:t xml:space="preserve">Gli applicativi PezzaliApp condividono alcune linee guida di design e implementazione:</w:t>
+      </w:r>
+    </w:p>
+    <w:p>
+      <w:pPr>
+        <w:numPr>
+          <w:ilvl w:val="0"/>
+          <w:numId w:val="1036"/>
+        </w:numPr>
+        <w:pStyle w:val="Compact"/>
+      </w:pPr>
+      <w:r>
+        <w:rPr>
+          <w:bCs/>
+          <w:b/>
+        </w:rPr>
+        <w:t xml:space="preserve">Dark theme</w:t>
+      </w:r>
+      <w:r>
+        <w:t xml:space="preserve"> </w:t>
+      </w:r>
+      <w:r>
+        <w:t xml:space="preserve">come default, con accenti ad alto contrasto (giallo</w:t>
+      </w:r>
+      <w:r>
+        <w:t xml:space="preserve"> </w:t>
+      </w:r>
+      <w:r>
+        <w:rPr>
+          <w:rStyle w:val="VerbatimChar"/>
+        </w:rPr>
+        <w:t xml:space="preserve">#e8ff47</w:t>
+      </w:r>
+      <w:r>
+        <w:t xml:space="preserve"> </w:t>
+      </w:r>
+      <w:r>
+        <w:t xml:space="preserve">per i prodotti audio/workshop, verde per i prodotti generici)</w:t>
+      </w:r>
+    </w:p>
+    <w:p>
+      <w:pPr>
+        <w:numPr>
+          <w:ilvl w:val="0"/>
+          <w:numId w:val="1036"/>
+        </w:numPr>
+        <w:pStyle w:val="Compact"/>
+      </w:pPr>
+      <w:r>
+        <w:rPr>
+          <w:bCs/>
+          <w:b/>
+        </w:rPr>
+        <w:t xml:space="preserve">Typography</w:t>
+      </w:r>
+      <w:r>
+        <w:t xml:space="preserve"> </w:t>
+      </w:r>
+      <w:r>
+        <w:t xml:space="preserve">a base monospaziale per le informazioni tecniche (BPM, valori numerici, percentuali)</w:t>
+      </w:r>
+    </w:p>
+    <w:p>
+      <w:pPr>
+        <w:numPr>
+          <w:ilvl w:val="0"/>
+          <w:numId w:val="1036"/>
+        </w:numPr>
+        <w:pStyle w:val="Compact"/>
+      </w:pPr>
+      <w:r>
+        <w:rPr>
+          <w:bCs/>
+          <w:b/>
+        </w:rPr>
+        <w:t xml:space="preserve">Mobile-first responsive</w:t>
+      </w:r>
+      <w:r>
+        <w:t xml:space="preserve">: ogni applicazione è progettata anche per schermo telefono</w:t>
+      </w:r>
+    </w:p>
+    <w:p>
+      <w:pPr>
+        <w:numPr>
+          <w:ilvl w:val="0"/>
+          <w:numId w:val="1036"/>
+        </w:numPr>
+        <w:pStyle w:val="Compact"/>
+      </w:pPr>
+      <w:r>
+        <w:rPr>
+          <w:bCs/>
+          <w:b/>
+        </w:rPr>
+        <w:t xml:space="preserve">Installabilità PWA</w:t>
+      </w:r>
+      <w:r>
+        <w:t xml:space="preserve"> </w:t>
+      </w:r>
+      <w:r>
+        <w:t xml:space="preserve">come priorità di primo livello</w:t>
+      </w:r>
+    </w:p>
+    <w:p>
+      <w:pPr>
+        <w:numPr>
+          <w:ilvl w:val="0"/>
+          <w:numId w:val="1036"/>
+        </w:numPr>
+        <w:pStyle w:val="Compact"/>
+      </w:pPr>
+      <w:r>
+        <w:rPr>
+          <w:bCs/>
+          <w:b/>
+        </w:rPr>
+        <w:t xml:space="preserve">Deploy semplice</w:t>
+      </w:r>
+      <w:r>
+        <w:t xml:space="preserve">: GitHub Pages o Cloudflare Pages, niente server backend</w:t>
+      </w:r>
+    </w:p>
+    <w:bookmarkEnd w:id="106"/>
+    <w:bookmarkStart w:id="109" w:name="contributi-e-feedback"/>
+    <w:p>
+      <w:pPr>
+        <w:pStyle w:val="Heading3"/>
+      </w:pPr>
+      <w:r>
+        <w:t xml:space="preserve">18.4 Contributi e feedback</w:t>
+      </w:r>
+    </w:p>
+    <w:p>
+      <w:pPr>
+        <w:pStyle w:val="FirstParagraph"/>
+      </w:pPr>
+      <w:r>
+        <w:t xml:space="preserve">djApp è un progetto aperto. Segnalazioni di bug, proposte di miglioramento e pull request sono benvenute tramite:</w:t>
+      </w:r>
+    </w:p>
+    <w:p>
+      <w:pPr>
+        <w:numPr>
+          <w:ilvl w:val="0"/>
+          <w:numId w:val="1037"/>
+        </w:numPr>
+        <w:pStyle w:val="Compact"/>
+      </w:pPr>
+      <w:r>
+        <w:rPr>
+          <w:bCs/>
+          <w:b/>
+        </w:rPr>
+        <w:t xml:space="preserve">Issue tracker</w:t>
+      </w:r>
+      <w:r>
+        <w:t xml:space="preserve">:</w:t>
+      </w:r>
+      <w:r>
+        <w:t xml:space="preserve"> </w:t>
+      </w:r>
+      <w:hyperlink r:id="rId107">
+        <w:r>
+          <w:rPr>
+            <w:rStyle w:val="Hyperlink"/>
+          </w:rPr>
+          <w:t xml:space="preserve">github.com/pezzaliapp/djapp-new/issues</w:t>
+        </w:r>
+      </w:hyperlink>
+    </w:p>
+    <w:p>
+      <w:pPr>
+        <w:numPr>
+          <w:ilvl w:val="0"/>
+          <w:numId w:val="1037"/>
+        </w:numPr>
+        <w:pStyle w:val="Compact"/>
+      </w:pPr>
+      <w:r>
+        <w:rPr>
+          <w:bCs/>
+          <w:b/>
+        </w:rPr>
+        <w:t xml:space="preserve">Pull request</w:t>
+      </w:r>
+      <w:r>
+        <w:t xml:space="preserve">:</w:t>
+      </w:r>
+      <w:r>
+        <w:t xml:space="preserve"> </w:t>
+      </w:r>
+      <w:hyperlink r:id="rId108">
+        <w:r>
+          <w:rPr>
+            <w:rStyle w:val="Hyperlink"/>
+          </w:rPr>
+          <w:t xml:space="preserve">github.com/pezzaliapp/djapp-new/pulls</w:t>
+        </w:r>
+      </w:hyperlink>
+    </w:p>
+    <w:p>
+      <w:pPr>
+        <w:pStyle w:val="FirstParagraph"/>
+      </w:pPr>
+      <w:r>
+        <w:t xml:space="preserve">Le roadmap future dell’applicazione sono documentate nel</w:t>
+      </w:r>
+      <w:r>
+        <w:t xml:space="preserve"> </w:t>
+      </w:r>
+      <w:r>
+        <w:rPr>
+          <w:rStyle w:val="VerbatimChar"/>
+        </w:rPr>
+        <w:t xml:space="preserve">README.md</w:t>
+      </w:r>
+      <w:r>
+        <w:t xml:space="preserve"> </w:t>
+      </w:r>
+      <w:r>
+        <w:t xml:space="preserve">del repository.</w:t>
+      </w:r>
+    </w:p>
+    <w:p>
+      <w:r>
+        <w:pict>
+          <v:rect style="width:0;height:1.5pt" o:hralign="center" o:hrstd="t" o:hr="t"/>
+        </w:pict>
+      </w:r>
+    </w:p>
+    <w:p>
+      <w:pPr>
+        <w:pStyle w:val="FirstParagraph"/>
+      </w:pPr>
+      <w:r>
+        <w:rPr>
+          <w:bCs/>
+          <w:b/>
+        </w:rPr>
+        <w:t xml:space="preserve">Fine del manuale.</w:t>
+      </w:r>
+    </w:p>
+    <w:p>
+      <w:pPr>
+        <w:pStyle w:val="BodyText"/>
+      </w:pPr>
       <w:r>
         <w:rPr>
           <w:iCs/>
           <w:i/>
         </w:rPr>
-        <w:t xml:space="preserve"> </w:t>
-      </w:r>
-      <w:r>
-        <w:rPr>
-          <w:rStyle w:val="VerbatimChar"/>
+        <w:t xml:space="preserve">Documento verificato sul bundle</w:t>
+      </w:r>
+      <w:r>
+        <w:rPr>
           <w:iCs/>
           <w:i/>
         </w:rPr>
-        <w:t xml:space="preserve">index-N51-MIQm.js</w:t>
-      </w:r>
-      <w:r>
-        <w:rPr>
+        <w:t xml:space="preserve"> </w:t>
+      </w:r>
+      <w:r>
+        <w:rPr>
+          <w:rStyle w:val="VerbatimChar"/>
           <w:iCs/>
           <w:i/>
         </w:rPr>
-        <w:t xml:space="preserve"> </w:t>
+        <w:t xml:space="preserve">index-N51-MIQm.js</w:t>
       </w:r>
       <w:r>
         <w:rPr>
           <w:iCs/>
           <w:i/>
         </w:rPr>
-        <w:t xml:space="preserve">del commit corrente.</w:t>
-      </w:r>
-      <w:r>
         <w:t xml:space="preserve"> </w:t>
       </w:r>
       <w:r>
@@ -8284,12 +10002,22 @@
           <w:iCs/>
           <w:i/>
         </w:rPr>
-        <w:t xml:space="preserve">Aggiornato al 17 aprile 2026.</w:t>
-      </w:r>
-    </w:p>
-    <w:bookmarkEnd w:id="93"/>
-    <w:bookmarkEnd w:id="94"/>
-    <w:bookmarkEnd w:id="95"/>
+        <w:t xml:space="preserve">del commit corrente.</w:t>
+      </w:r>
+      <w:r>
+        <w:t xml:space="preserve"> </w:t>
+      </w:r>
+      <w:r>
+        <w:rPr>
+          <w:iCs/>
+          <w:i/>
+        </w:rPr>
+        <w:t xml:space="preserve">Versione 2.1 — aggiornata al 17 aprile 2026.</w:t>
+      </w:r>
+    </w:p>
+    <w:bookmarkEnd w:id="109"/>
+    <w:bookmarkEnd w:id="110"/>
+    <w:bookmarkEnd w:id="111"/>
     <w:sectPr/>
   </w:body>
 </w:document>
@@ -8861,6 +10589,30 @@
     <w:abstractNumId w:val="991"/>
   </w:num>
   <w:num w:numId="1029">
+    <w:abstractNumId w:val="991"/>
+  </w:num>
+  <w:num w:numId="1030">
+    <w:abstractNumId w:val="991"/>
+  </w:num>
+  <w:num w:numId="1031">
+    <w:abstractNumId w:val="991"/>
+  </w:num>
+  <w:num w:numId="1032">
+    <w:abstractNumId w:val="991"/>
+  </w:num>
+  <w:num w:numId="1033">
+    <w:abstractNumId w:val="991"/>
+  </w:num>
+  <w:num w:numId="1034">
+    <w:abstractNumId w:val="991"/>
+  </w:num>
+  <w:num w:numId="1035">
+    <w:abstractNumId w:val="991"/>
+  </w:num>
+  <w:num w:numId="1036">
+    <w:abstractNumId w:val="991"/>
+  </w:num>
+  <w:num w:numId="1037">
     <w:abstractNumId w:val="991"/>
   </w:num>
 </w:numbering>

</xml_diff>